<commit_message>
Remove supplementary figure and clean manuscript footer
</commit_message>
<xml_diff>
--- a/manuscript/ECMamba_application_note_main_bioinformatics_format_v2.docx
+++ b/manuscript/ECMamba_application_note_main_bioinformatics_format_v2.docx
@@ -267,7 +267,7 @@
                     </pic:cNvPicPr>
                   </pic:nvPicPr>
                   <pic:blipFill>
-                    <a:blip r:embed="rId9" cstate="none"/>
+                    <a:blip r:embed="rId7" cstate="none"/>
                     <a:srcRect/>
                     <a:stretch>
                       <a:fillRect/>
@@ -355,7 +355,7 @@
                     </pic:cNvPicPr>
                   </pic:nvPicPr>
                   <pic:blipFill>
-                    <a:blip r:embed="rId10" cstate="none"/>
+                    <a:blip r:embed="rId8" cstate="none"/>
                     <a:srcRect/>
                     <a:stretch>
                       <a:fillRect/>
@@ -611,8 +611,6 @@
       </w:r>
     </w:p>
     <w:sectPr>
-      <w:headerReference w:type="default" r:id="rId7"/>
-      <w:footerReference w:type="default" r:id="rId8"/>
       <w:pgSz w:w="12240" w:h="15840" w:orient="portrait"/>
       <w:pgMar w:top="1080" w:right="1080" w:bottom="1080" w:left="1080" w:header="708" w:footer="708" w:gutter="0"/>
       <w:pgNumType/>
@@ -663,35 +661,6 @@
 </w:endnotes>
 </file>
 
-<file path=word/footer1.xml><?xml version="1.0" encoding="utf-8"?>
-<w:ftr xmlns:wpc="http://schemas.microsoft.com/office/word/2010/wordprocessingCanvas" xmlns:mc="http://schemas.openxmlformats.org/markup-compatibility/2006" xmlns:o="urn:schemas-microsoft-com:office:office" xmlns:r="http://schemas.openxmlformats.org/officeDocument/2006/relationships" xmlns:m="http://schemas.openxmlformats.org/officeDocument/2006/math" xmlns:v="urn:schemas-microsoft-com:vml" xmlns:wp14="http://schemas.microsoft.com/office/word/2010/wordprocessingDrawing" xmlns:wp="http://schemas.openxmlformats.org/drawingml/2006/wordprocessingDrawing" xmlns:w10="urn:schemas-microsoft-com:office:word" xmlns:w="http://schemas.openxmlformats.org/wordprocessingml/2006/main" xmlns:w14="http://schemas.microsoft.com/office/word/2010/wordml" xmlns:w15="http://schemas.microsoft.com/office/word/2012/wordml" xmlns:wpg="http://schemas.microsoft.com/office/word/2010/wordprocessingGroup" xmlns:wpi="http://schemas.microsoft.com/office/word/2010/wordprocessingInk" xmlns:wne="http://schemas.microsoft.com/office/word/2006/wordml" xmlns:wps="http://schemas.microsoft.com/office/word/2010/wordprocessingShape">
-  <w:p>
-    <w:pPr>
-      <w:jc w:val="right"/>
-    </w:pPr>
-    <w:r>
-      <w:rPr>
-        <w:rFonts w:ascii="Times New Roman" w:cs="Times New Roman" w:eastAsia="Times New Roman" w:hAnsi="Times New Roman"/>
-        <w:sz w:val="18"/>
-        <w:szCs w:val="18"/>
-      </w:rPr>
-      <w:t xml:space="preserve">ECMamba  |  </w:t>
-    </w:r>
-    <w:r>
-      <w:rPr>
-        <w:rFonts w:ascii="Times New Roman" w:cs="Times New Roman" w:eastAsia="Times New Roman" w:hAnsi="Times New Roman"/>
-        <w:sz w:val="18"/>
-        <w:szCs w:val="18"/>
-      </w:rPr>
-      <w:fldChar w:fldCharType="begin"/>
-      <w:instrText xml:space="preserve">PAGE</w:instrText>
-      <w:fldChar w:fldCharType="separate"/>
-      <w:fldChar w:fldCharType="end"/>
-    </w:r>
-  </w:p>
-</w:ftr>
-</file>
-
 <file path=word/footnotes.xml><?xml version="1.0" encoding="utf-8"?>
 <w:footnotes xmlns:wpc="http://schemas.microsoft.com/office/word/2010/wordprocessingCanvas" xmlns:mc="http://schemas.openxmlformats.org/markup-compatibility/2006" xmlns:o="urn:schemas-microsoft-com:office:office" xmlns:r="http://schemas.openxmlformats.org/officeDocument/2006/relationships" xmlns:m="http://schemas.openxmlformats.org/officeDocument/2006/math" xmlns:v="urn:schemas-microsoft-com:vml" xmlns:wp14="http://schemas.microsoft.com/office/word/2010/wordprocessingDrawing" xmlns:wp="http://schemas.openxmlformats.org/drawingml/2006/wordprocessingDrawing" xmlns:w10="urn:schemas-microsoft-com:office:word" xmlns:w="http://schemas.openxmlformats.org/wordprocessingml/2006/main" xmlns:w14="http://schemas.microsoft.com/office/word/2010/wordml" xmlns:w15="http://schemas.microsoft.com/office/word/2012/wordml" xmlns:wpg="http://schemas.microsoft.com/office/word/2010/wordprocessingGroup" xmlns:wpi="http://schemas.microsoft.com/office/word/2010/wordprocessingInk" xmlns:wne="http://schemas.microsoft.com/office/word/2006/wordml" xmlns:wps="http://schemas.microsoft.com/office/word/2010/wordprocessingShape" mc:Ignorable="w14 w15 wp14">
   <w:footnote w:type="separator" w:id="-1">
@@ -727,12 +696,6 @@
     </w:p>
   </w:footnote>
 </w:footnotes>
-</file>
-
-<file path=word/header1.xml><?xml version="1.0" encoding="utf-8"?>
-<w:hdr xmlns:wpc="http://schemas.microsoft.com/office/word/2010/wordprocessingCanvas" xmlns:mc="http://schemas.openxmlformats.org/markup-compatibility/2006" xmlns:o="urn:schemas-microsoft-com:office:office" xmlns:r="http://schemas.openxmlformats.org/officeDocument/2006/relationships" xmlns:m="http://schemas.openxmlformats.org/officeDocument/2006/math" xmlns:v="urn:schemas-microsoft-com:vml" xmlns:wp14="http://schemas.microsoft.com/office/word/2010/wordprocessingDrawing" xmlns:wp="http://schemas.openxmlformats.org/drawingml/2006/wordprocessingDrawing" xmlns:w10="urn:schemas-microsoft-com:office:word" xmlns:w="http://schemas.openxmlformats.org/wordprocessingml/2006/main" xmlns:w14="http://schemas.microsoft.com/office/word/2010/wordml" xmlns:w15="http://schemas.microsoft.com/office/word/2012/wordml" xmlns:wpg="http://schemas.microsoft.com/office/word/2010/wordprocessingGroup" xmlns:wpi="http://schemas.microsoft.com/office/word/2010/wordprocessingInk" xmlns:wne="http://schemas.microsoft.com/office/word/2006/wordml" xmlns:wps="http://schemas.microsoft.com/office/word/2010/wordprocessingShape" xmlns:cx="http://schemas.microsoft.com/office/drawing/2014/chartex" xmlns:cx1="http://schemas.microsoft.com/office/drawing/2015/9/8/chartex" xmlns:cx2="http://schemas.microsoft.com/office/drawing/2015/10/21/chartex" xmlns:cx3="http://schemas.microsoft.com/office/drawing/2016/5/9/chartex" xmlns:cx4="http://schemas.microsoft.com/office/drawing/2016/5/10/chartex" xmlns:cx5="http://schemas.microsoft.com/office/drawing/2016/5/11/chartex" xmlns:cx6="http://schemas.microsoft.com/office/drawing/2016/5/12/chartex" xmlns:cx7="http://schemas.microsoft.com/office/drawing/2016/5/13/chartex" xmlns:cx8="http://schemas.microsoft.com/office/drawing/2016/5/14/chartex" xmlns:w16cid="http://schemas.microsoft.com/office/word/2016/wordml/cid" xmlns:w16se="http://schemas.microsoft.com/office/word/2015/wordml/symex">
-  <w:p/>
-</w:hdr>
 </file>
 
 <file path=word/numbering.xml><?xml version="1.0" encoding="utf-8"?>

</xml_diff>